<commit_message>
Resume: IAM Security Analyst @ Cloudflare (MNC)
</commit_message>
<xml_diff>
--- a/resumes/Resume_IAM_Security_Analyst_Cloudflare__MNC_.docx
+++ b/resumes/Resume_IAM_Security_Analyst_Cloudflare__MNC_.docx
@@ -412,7 +412,7 @@
           <w:sz w:val="19"/>
           <w:szCs w:val="19"/>
         </w:rPr>
-        <w:t>Triaged 50+ weekly inventory reimbursement cases by severity and policy eligibility, mirroring the structured alert triage and escalation workflow used in IAM and SOC Tier 1 analyst roles.</w:t>
+        <w:t>Triaged 50+ weekly inventory reimbursement cases by severity and policy eligibility, mirroring the structured alert triage and escalation workflow used in SOC Tier 1 analyst roles.</w:t>
       </w:r>
       <w:proofErr w:type="spellStart"/>
       <w:r>
@@ -449,7 +449,7 @@
           <w:sz w:val="19"/>
           <w:szCs w:val="19"/>
         </w:rPr>
-        <w:t>Performed root cause analysis on seller claims to identify policy violations and anomalous patterns; escalated findings to senior reviewers, demonstrating investigative instincts central to IAM and fraud analyst operations.</w:t>
+        <w:t>Performed root cause analysis on seller claims to identify policy violations and anomalous patterns; escalated findings to senior reviewers, demonstrating investigative instincts central to SOC and fraud analyst operations.</w:t>
       </w:r>
     </w:p>
     <w:p>
@@ -562,7 +562,7 @@
           <w:sz w:val="19"/>
           <w:szCs w:val="19"/>
         </w:rPr>
-        <w:t>Deployed Splunk SIEM with SPL correlation (detection engineering) searches for brute-force detection (index=* failed | stats count by src_ip), lateral movement, and privilege escalation; mapped TTPs to MITRE ATT&amp;CK (TTP mapping) (T1110, T1078, T1059) and wrote incident report.</w:t>
+        <w:t>Deployed Splunk SIEM with SPL correlation (detection engineering) searches for brute-force detection (index=* failed | stats count by src_ip), lateral movement, and privilege escalation; mapped TTPs to MITRE ATT&amp;CK (TTP mapping) (T1110, T1078, T1059) and wrote PICERL incident report.</w:t>
       </w:r>
     </w:p>
     <w:p>
@@ -581,7 +581,7 @@
           <w:sz w:val="19"/>
           <w:szCs w:val="19"/>
         </w:rPr>
-        <w:t>Built automated SOAR (security orchestration and automation)-style detection pipeline: Python script ingests Splunk alerts, runs IOC enrichment (threat intelligence) via VirusTotal API, and dispatches Telegram notifications with severity classification — reducing mean time to triage by automating repetitive tasks.</w:t>
+        <w:t>Built automated SOAR (security orchestration and automation)-style detection pipeline: Python script ingests Splunk alerts, runs IOC enrichment (threat intelligence) via VirusTotal API, and dispatches Telegram notifications with severity classification — reducing mean time to triage by automating repetitive L1 tasks.</w:t>
       </w:r>
     </w:p>
     <w:p>

</xml_diff>